<commit_message>
Première mise à jour énoncés d'exercices - typo
</commit_message>
<xml_diff>
--- a/enonces/ABS_enonces.docx
+++ b/enonces/ABS_enonces.docx
@@ -10,8 +10,8 @@
         <w:rPr>
           <w:rFonts w:asciiTheme="minorHAnsi" w:hAnsiTheme="minorHAnsi"/>
           <w:color w:val="000000" w:themeColor="text1"/>
-          <w:sz w:val="28"/>
-          <w:szCs w:val="28"/>
+          <w:sz w:val="36"/>
+          <w:szCs w:val="36"/>
         </w:rPr>
       </w:pPr>
       <w:r>
@@ -20,8 +20,8 @@
           <w:i/>
           <w:noProof/>
           <w:color w:val="000000" w:themeColor="text1"/>
-          <w:sz w:val="28"/>
-          <w:szCs w:val="28"/>
+          <w:sz w:val="36"/>
+          <w:szCs w:val="36"/>
         </w:rPr>
         <w:drawing>
           <wp:inline distT="0" distB="0" distL="0" distR="0" wp14:anchorId="57FEC179" wp14:editId="635117E5">
@@ -75,8 +75,8 @@
           <w:rFonts w:asciiTheme="minorHAnsi" w:hAnsiTheme="minorHAnsi" w:cs="Arial"/>
           <w:i/>
           <w:color w:val="000000" w:themeColor="text1"/>
-          <w:sz w:val="28"/>
-          <w:szCs w:val="28"/>
+          <w:sz w:val="36"/>
+          <w:szCs w:val="36"/>
         </w:rPr>
         <w:t xml:space="preserve"> </w:t>
       </w:r>
@@ -85,8 +85,8 @@
           <w:rFonts w:asciiTheme="minorHAnsi" w:hAnsiTheme="minorHAnsi" w:cs="Arial"/>
           <w:i/>
           <w:color w:val="000000" w:themeColor="text1"/>
-          <w:sz w:val="28"/>
-          <w:szCs w:val="28"/>
+          <w:sz w:val="36"/>
+          <w:szCs w:val="36"/>
         </w:rPr>
         <w:tab/>
       </w:r>
@@ -94,8 +94,8 @@
         <w:rPr>
           <w:rFonts w:asciiTheme="minorHAnsi" w:hAnsiTheme="minorHAnsi" w:cs="Arial"/>
           <w:color w:val="000000" w:themeColor="text1"/>
-          <w:sz w:val="28"/>
-          <w:szCs w:val="28"/>
+          <w:sz w:val="36"/>
+          <w:szCs w:val="36"/>
         </w:rPr>
         <w:t xml:space="preserve">Année académique </w:t>
       </w:r>
@@ -104,8 +104,8 @@
           <w:rFonts w:asciiTheme="minorHAnsi" w:hAnsiTheme="minorHAnsi" w:cs="Arial"/>
           <w:b/>
           <w:color w:val="000000" w:themeColor="text1"/>
-          <w:sz w:val="28"/>
-          <w:szCs w:val="28"/>
+          <w:sz w:val="36"/>
+          <w:szCs w:val="36"/>
         </w:rPr>
         <w:t>202</w:t>
       </w:r>
@@ -114,8 +114,8 @@
           <w:rFonts w:asciiTheme="minorHAnsi" w:hAnsiTheme="minorHAnsi" w:cs="Arial"/>
           <w:b/>
           <w:color w:val="000000" w:themeColor="text1"/>
-          <w:sz w:val="28"/>
-          <w:szCs w:val="28"/>
+          <w:sz w:val="36"/>
+          <w:szCs w:val="36"/>
         </w:rPr>
         <w:t>6</w:t>
       </w:r>
@@ -124,8 +124,8 @@
           <w:rFonts w:asciiTheme="minorHAnsi" w:hAnsiTheme="minorHAnsi" w:cs="Arial"/>
           <w:b/>
           <w:color w:val="000000" w:themeColor="text1"/>
-          <w:sz w:val="28"/>
-          <w:szCs w:val="28"/>
+          <w:sz w:val="36"/>
+          <w:szCs w:val="36"/>
         </w:rPr>
         <w:t>-202</w:t>
       </w:r>
@@ -134,8 +134,8 @@
           <w:rFonts w:asciiTheme="minorHAnsi" w:hAnsiTheme="minorHAnsi" w:cs="Arial"/>
           <w:b/>
           <w:color w:val="000000" w:themeColor="text1"/>
-          <w:sz w:val="28"/>
-          <w:szCs w:val="28"/>
+          <w:sz w:val="36"/>
+          <w:szCs w:val="36"/>
         </w:rPr>
         <w:t>7</w:t>
       </w:r>
@@ -183,16 +183,16 @@
         <w:rPr>
           <w:rFonts w:ascii="Calibri" w:hAnsi="Calibri" w:cs="Calibri"/>
           <w:color w:val="000000" w:themeColor="text1"/>
-          <w:sz w:val="28"/>
-          <w:szCs w:val="28"/>
+          <w:sz w:val="32"/>
+          <w:szCs w:val="32"/>
         </w:rPr>
       </w:pPr>
       <w:r>
         <w:rPr>
           <w:rFonts w:ascii="Calibri" w:hAnsi="Calibri" w:cs="Calibri"/>
           <w:color w:val="000000" w:themeColor="text1"/>
-          <w:sz w:val="32"/>
-          <w:szCs w:val="32"/>
+          <w:sz w:val="36"/>
+          <w:szCs w:val="36"/>
         </w:rPr>
         <w:t>Programmation orientée objet — Java</w:t>
       </w:r>
@@ -261,16 +261,16 @@
         <w:rPr>
           <w:rFonts w:ascii="Calibri" w:hAnsi="Calibri" w:cs="Calibri"/>
           <w:color w:val="000000" w:themeColor="text1"/>
-          <w:sz w:val="28"/>
-          <w:szCs w:val="28"/>
+          <w:sz w:val="32"/>
+          <w:szCs w:val="32"/>
         </w:rPr>
       </w:pPr>
       <w:r>
         <w:rPr>
           <w:rFonts w:ascii="Calibri" w:hAnsi="Calibri" w:cs="Calibri"/>
           <w:color w:val="000000" w:themeColor="text1"/>
-          <w:sz w:val="32"/>
-          <w:szCs w:val="32"/>
+          <w:sz w:val="36"/>
+          <w:szCs w:val="36"/>
         </w:rPr>
         <w:t>Ce qui est commun monte, ce qui varie descend</w:t>
       </w:r>
@@ -393,44 +393,35 @@
           <w:szCs w:val="28"/>
         </w:rPr>
       </w:pPr>
-      <w:r>
+    </w:p>
+    <w:p>
+      <w:pPr>
+        <w:spacing w:after="120"/>
+        <w:jc w:val="center"/>
         <w:rPr>
           <w:rFonts w:ascii="Calibri" w:hAnsi="Calibri" w:cs="Calibri"/>
           <w:color w:val="000000" w:themeColor="text1"/>
-          <w:sz w:val="28"/>
-          <w:szCs w:val="28"/>
-        </w:rPr>
-        <w:t>EPHEC — Bachelier en informatique, niveau 2</w:t>
-      </w:r>
-    </w:p>
-    <w:p>
-      <w:pPr>
-        <w:spacing w:after="120"/>
-        <w:jc w:val="center"/>
+          <w:sz w:val="36"/>
+          <w:szCs w:val="36"/>
+        </w:rPr>
+      </w:pPr>
+      <w:r>
         <w:rPr>
           <w:rFonts w:ascii="Calibri" w:hAnsi="Calibri" w:cs="Calibri"/>
           <w:color w:val="000000" w:themeColor="text1"/>
-          <w:sz w:val="28"/>
-          <w:szCs w:val="28"/>
-        </w:rPr>
-      </w:pPr>
-      <w:r>
+          <w:sz w:val="36"/>
+          <w:szCs w:val="36"/>
+        </w:rPr>
+        <w:t>EPHEC — Bachelier en informatique, niveau 2</w:t>
+      </w:r>
+    </w:p>
+    <w:p>
+      <w:pPr>
         <w:rPr>
           <w:rFonts w:ascii="Calibri" w:hAnsi="Calibri" w:cs="Calibri"/>
           <w:color w:val="000000" w:themeColor="text1"/>
-          <w:sz w:val="28"/>
-          <w:szCs w:val="28"/>
-        </w:rPr>
-        <w:t>Année académique 2026-2027</w:t>
-      </w:r>
-    </w:p>
-    <w:p>
-      <w:pPr>
-        <w:rPr>
-          <w:rFonts w:ascii="Calibri" w:hAnsi="Calibri" w:cs="Calibri"/>
-          <w:color w:val="000000" w:themeColor="text1"/>
-          <w:sz w:val="28"/>
-          <w:szCs w:val="28"/>
+          <w:sz w:val="36"/>
+          <w:szCs w:val="36"/>
         </w:rPr>
         <w:sectPr>
           <w:pgSz w:w="11906" w:h="16838"/>

</xml_diff>